<commit_message>
Credit the group in the join experiments report
Co-Authored-By: Claude Opus 5.5 <noreply@anthropic.com>
</commit_message>
<xml_diff>
--- a/report/SimpleDB+ Join Experiments.docx
+++ b/report/SimpleDB+ Join Experiments.docx
@@ -19,7 +19,7 @@
         <w:t xml:space="preserve"> · </w:t>
       </w:r>
       <w:r>
-        <w:t xml:space="preserve">@Nicholas</w:t>
+        <w:t xml:space="preserve">Nicholas, Andong and Zenn</w:t>
       </w:r>
     </w:p>
     <w:p>
@@ -33,7 +33,7 @@
     <w:p>
       <w:pPr/>
       <w:r>
-        <w:t xml:space="preserve">All timings are on a scaled-up student database built by </w:t>
+        <w:t xml:space="preserve">We ran all timings on a scaled-up student database built by </w:t>
       </w:r>
       <w:r>
         <w:rPr>

</xml_diff>